<commit_message>
modified the terraform.tfvars as well created the output.tf in dev
</commit_message>
<xml_diff>
--- a/Enterprise level topics.docx
+++ b/Enterprise level topics.docx
@@ -63,7 +63,15 @@
         <w:t xml:space="preserve"> When </w:t>
       </w:r>
       <w:r>
-        <w:t>VM has the private IP address associated with, in order to have outbound internet access it should have NAT gatway.</w:t>
+        <w:t xml:space="preserve">VM has the private IP address associated with, in order to have outbound internet access it should have NAT </w:t>
+      </w:r>
+      <w:proofErr w:type="spellStart"/>
+      <w:r>
+        <w:t>gatway</w:t>
+      </w:r>
+      <w:proofErr w:type="spellEnd"/>
+      <w:r>
+        <w:t>.</w:t>
       </w:r>
       <w:r>
         <w:br/>
@@ -94,7 +102,15 @@
         <w:t xml:space="preserve">. </w:t>
       </w:r>
       <w:r>
-        <w:t xml:space="preserve">It connects the VM to a subnet within a VNet, provides the VM with a private IP address, and can optionally be associated with a public IP </w:t>
+        <w:t xml:space="preserve">It connects the VM to a subnet within a </w:t>
+      </w:r>
+      <w:proofErr w:type="spellStart"/>
+      <w:r>
+        <w:t>VNet</w:t>
+      </w:r>
+      <w:proofErr w:type="spellEnd"/>
+      <w:r>
+        <w:t xml:space="preserve">, provides the VM with a private IP address, and can optionally be associated with a public IP </w:t>
       </w:r>
       <w:r>
         <w:br/>
@@ -272,15 +288,32 @@
       <w:r>
         <w:t xml:space="preserve">The </w:t>
       </w:r>
+      <w:proofErr w:type="spellStart"/>
       <w:r>
         <w:rPr>
           <w:b/>
           <w:bCs/>
         </w:rPr>
-        <w:t>mvn clean compile</w:t>
-      </w:r>
-      <w:r>
-        <w:t xml:space="preserve"> command first removes any previous build artifacts by deleting the target directory. It then compiles all the Java source files into bytecode (.class files) and stores them under the target/classes directory. These .class files are the bytecode that the JVM can execute. At this stage, the application is only compiled—it has not yet been packaged into a WAR or JAR file.</w:t>
+        <w:t>mvn</w:t>
+      </w:r>
+      <w:proofErr w:type="spellEnd"/>
+      <w:r>
+        <w:rPr>
+          <w:b/>
+          <w:bCs/>
+        </w:rPr>
+        <w:t xml:space="preserve"> clean compile</w:t>
+      </w:r>
+      <w:r>
+        <w:t xml:space="preserve"> command first removes any previous build artifacts by deleting the target directory. It then compiles all the Java source files into bytecode (.class files) and stores them under the target/</w:t>
+      </w:r>
+      <w:proofErr w:type="gramStart"/>
+      <w:r>
+        <w:t>classes</w:t>
+      </w:r>
+      <w:proofErr w:type="gramEnd"/>
+      <w:r>
+        <w:t xml:space="preserve"> directory. These .class files are the bytecode that the JVM can execute. At this stage, the application is only compiled—it has not yet been packaged into a WAR or JAR file.</w:t>
       </w:r>
     </w:p>
     <w:p>
@@ -316,23 +349,94 @@
       <w:r>
         <w:t xml:space="preserve"> that your application uses.</w:t>
       </w:r>
-      <w:r>
-        <w:br/>
-      </w:r>
-    </w:p>
-    <w:p>
-      <w:pPr>
+    </w:p>
+    <w:p>
+      <w:pPr>
+        <w:pStyle w:val="ListParagraph"/>
+      </w:pPr>
+    </w:p>
+    <w:p>
+      <w:pPr>
+        <w:pStyle w:val="ListParagraph"/>
+        <w:numPr>
+          <w:ilvl w:val="0"/>
+          <w:numId w:val="4"/>
+        </w:numPr>
+      </w:pPr>
+      <w:r>
         <w:rPr>
           <w:b/>
           <w:bCs/>
         </w:rPr>
-      </w:pPr>
+        <w:lastRenderedPageBreak/>
+        <w:t>SonarQube Analysis</w:t>
+      </w:r>
+      <w:r>
+        <w:t xml:space="preserve"> is the process of </w:t>
+      </w:r>
       <w:r>
         <w:rPr>
           <w:b/>
           <w:bCs/>
         </w:rPr>
-        <w:lastRenderedPageBreak/>
+        <w:t>scanning your source code to identify code quality issues, security vulnerabilities, bugs, and code smells</w:t>
+      </w:r>
+      <w:r>
+        <w:t xml:space="preserve"> before the application is deployed.</w:t>
+      </w:r>
+    </w:p>
+    <w:p>
+      <w:pPr>
+        <w:pStyle w:val="ListParagraph"/>
+      </w:pPr>
+    </w:p>
+    <w:p>
+      <w:pPr>
+        <w:pStyle w:val="ListParagraph"/>
+        <w:numPr>
+          <w:ilvl w:val="0"/>
+          <w:numId w:val="4"/>
+        </w:numPr>
+      </w:pPr>
+      <w:r>
+        <w:t xml:space="preserve">A </w:t>
+      </w:r>
+      <w:r>
+        <w:rPr>
+          <w:b/>
+          <w:bCs/>
+        </w:rPr>
+        <w:t>Quality Gate</w:t>
+      </w:r>
+      <w:r>
+        <w:t xml:space="preserve"> in SonarQube is a </w:t>
+      </w:r>
+      <w:r>
+        <w:rPr>
+          <w:b/>
+          <w:bCs/>
+        </w:rPr>
+        <w:t>set of conditions that determines whether your code meets the organization's quality standards</w:t>
+      </w:r>
+      <w:r>
+        <w:t>.</w:t>
+      </w:r>
+      <w:r>
+        <w:br/>
+      </w:r>
+    </w:p>
+    <w:p>
+      <w:pPr>
+        <w:rPr>
+          <w:b/>
+          <w:bCs/>
+        </w:rPr>
+      </w:pPr>
+      <w:r>
+        <w:rPr>
+          <w:b/>
+          <w:bCs/>
+        </w:rPr>
         <w:t>How to push the image to another VM</w:t>
       </w:r>
       <w:r>
@@ -395,14 +499,24 @@
       <w:r>
         <w:br/>
       </w:r>
-      <w:r>
-        <w:t>sudo apt update</w:t>
+      <w:proofErr w:type="spellStart"/>
+      <w:r>
+        <w:t>sudo</w:t>
+      </w:r>
+      <w:proofErr w:type="spellEnd"/>
+      <w:r>
+        <w:t xml:space="preserve"> apt update</w:t>
       </w:r>
       <w:r>
         <w:br/>
       </w:r>
-      <w:r>
-        <w:t>sudo apt install ansible -y</w:t>
+      <w:proofErr w:type="spellStart"/>
+      <w:r>
+        <w:t>sudo</w:t>
+      </w:r>
+      <w:proofErr w:type="spellEnd"/>
+      <w:r>
+        <w:t xml:space="preserve"> apt install ansible -y</w:t>
       </w:r>
     </w:p>
     <w:p>
@@ -459,7 +573,15 @@
         <w:t xml:space="preserve">               </w:t>
       </w:r>
       <w:r>
-        <w:t>ssh-keygen -t rsa -b 4096</w:t>
+        <w:t xml:space="preserve">ssh-keygen -t </w:t>
+      </w:r>
+      <w:proofErr w:type="spellStart"/>
+      <w:r>
+        <w:t>rsa</w:t>
+      </w:r>
+      <w:proofErr w:type="spellEnd"/>
+      <w:r>
+        <w:t xml:space="preserve"> -b 4096</w:t>
       </w:r>
       <w:r>
         <w:br/>
@@ -481,8 +603,13 @@
         <w:t xml:space="preserve">               </w:t>
       </w:r>
       <w:r>
-        <w:t>~/.ssh/id_rsa</w:t>
-      </w:r>
+        <w:t>~/.ssh/</w:t>
+      </w:r>
+      <w:proofErr w:type="spellStart"/>
+      <w:r>
+        <w:t>id_rsa</w:t>
+      </w:r>
+      <w:proofErr w:type="spellEnd"/>
     </w:p>
     <w:p>
       <w:r>
@@ -516,7 +643,15 @@
         <w:br/>
       </w:r>
       <w:r>
-        <w:t>sometimes you may push the id_rsa.pub key but if you try to connect to vm you will receive this error</w:t>
+        <w:t xml:space="preserve">sometimes you may push the id_rsa.pub key but if you try to connect to </w:t>
+      </w:r>
+      <w:proofErr w:type="spellStart"/>
+      <w:r>
+        <w:t>vm</w:t>
+      </w:r>
+      <w:proofErr w:type="spellEnd"/>
+      <w:r>
+        <w:t xml:space="preserve"> you will receive this error</w:t>
       </w:r>
       <w:r>
         <w:br/>
@@ -527,11 +662,51 @@
         <w:pStyle w:val="ListParagraph"/>
       </w:pPr>
       <w:r>
-        <w:t xml:space="preserve">/usr/bin/ssh-copy-id: ERROR: @@@@@@@@@@@@@@@@@@@@@@@@@@@@@@@@@@@@@@@@@@@@@@@@@@@@@@@@@@@ ERROR: @ WARNING: REMOTE HOST IDENTIFICATION HAS CHANGED! @ ERROR: @@@@@@@@@@@@@@@@@@@@@@@@@@@@@@@@@@@@@@@@@@@@@@@@@@@@@@@@@@@ ERROR: IT IS POSSIBLE THAT SOMEONE IS DOING SOMETHING NASTY! ERROR: Someone could be eavesdropping on you right now (man-in-the-middle attack)! ERROR: It is also possible that a host key has just been changed. ERROR: The fingerprint for the ED25519 key sent by the remote host is ERROR: </w:t>
+        <w:t>/</w:t>
+      </w:r>
+      <w:proofErr w:type="spellStart"/>
+      <w:r>
+        <w:t>usr</w:t>
+      </w:r>
+      <w:proofErr w:type="spellEnd"/>
+      <w:r>
+        <w:t>/bin/ssh-copy-id: ERROR: @@@@@@@@@@@@@@@@@@@@@@@@@@@@@@@@@@@@@@</w:t>
       </w:r>
       <w:r>
         <w:lastRenderedPageBreak/>
-        <w:t xml:space="preserve">SHA256:RJA5ES6X6isrOH8cMzosk4upD9mKw/T1QiDc4PdrHEc. ERROR: Please contact your system administrator. ERROR: Add correct host key in /root/.ssh/known_hosts to get rid of this message. ERROR: Offending ECDSA key in /root/.ssh/known_hosts:3 ERROR: remove with: ERROR: ssh-keygen -f '/root/.ssh/known_hosts' -R '10.1.1.4' ERROR: Host key for 10.1.1.4 has changed and you have requested strict checking. ERROR: Host key verification failed. root@testing:/home/Vicky# ssh-copy-id -i /root/.ssh/id_rsa.pub </w:t>
+        <w:t>@@@@@@@@@@@@@@@@@@@@@ ERROR: @ WARNING: REMOTE HOST IDENTIFICATION HAS CHANGED! @ ERROR: @@@@@@@@@@@@@@@@@@@@@@@@@@@@@@@@@@@@@@@@@@@@@@@@@@@@@@@@@@@ ERROR: IT IS POSSIBLE THAT SOMEONE IS DOING SOMETHING NASTY! ERROR: Someone could be eavesdropping on you right now (man-in-the-middle attack)! ERROR: It is also possible that a host key has just been changed. ERROR: The fingerprint for the ED25519 key sent by the remote host is ERROR: SHA256:RJA5ES6X6isrOH8cMzosk4upD9mKw/T1QiDc4PdrHEc. ERROR: Please contact your system administrator. ERROR: Add correct host key in /root/.ssh/</w:t>
+      </w:r>
+      <w:proofErr w:type="spellStart"/>
+      <w:r>
+        <w:t>known_hosts</w:t>
+      </w:r>
+      <w:proofErr w:type="spellEnd"/>
+      <w:r>
+        <w:t xml:space="preserve"> to get rid of this message. ERROR: Offending ECDSA key in /root/.ssh/known_hosts:3 ERROR: remove with: ERROR: ssh-keygen -f '/root/.ssh/</w:t>
+      </w:r>
+      <w:proofErr w:type="spellStart"/>
+      <w:r>
+        <w:t>known_hosts</w:t>
+      </w:r>
+      <w:proofErr w:type="spellEnd"/>
+      <w:r>
+        <w:t xml:space="preserve">' -R '10.1.1.4' ERROR: Host key for 10.1.1.4 has changed and you have requested strict checking. ERROR: Host key verification failed. </w:t>
+      </w:r>
+      <w:proofErr w:type="spellStart"/>
+      <w:r>
+        <w:t>root@testing</w:t>
+      </w:r>
+      <w:proofErr w:type="spellEnd"/>
+      <w:r>
+        <w:t>:/home/Vicky# ssh-copy-id -</w:t>
+      </w:r>
+      <w:proofErr w:type="spellStart"/>
+      <w:r>
+        <w:t>i</w:t>
+      </w:r>
+      <w:proofErr w:type="spellEnd"/>
+      <w:r>
+        <w:t xml:space="preserve"> /root/.ssh/id_rsa.pub </w:t>
       </w:r>
       <w:hyperlink r:id="rId7" w:history="1">
         <w:r>
@@ -562,7 +737,15 @@
         <w:pStyle w:val="ListParagraph"/>
       </w:pPr>
       <w:r>
-        <w:t>ssh-keygen -f "/root/.ssh/known_hosts" -R "10.1.1.4"</w:t>
+        <w:t>ssh-keygen -f "/root/.ssh/</w:t>
+      </w:r>
+      <w:proofErr w:type="spellStart"/>
+      <w:r>
+        <w:t>known_hosts</w:t>
+      </w:r>
+      <w:proofErr w:type="spellEnd"/>
+      <w:r>
+        <w:t>" -R "10.1.1.4"</w:t>
       </w:r>
     </w:p>
     <w:p>
@@ -593,7 +776,15 @@
         <w:pStyle w:val="ListParagraph"/>
       </w:pPr>
       <w:r>
-        <w:t>ssh-copy-id -i /root/.ssh/id_rsa.pub azureuser@10.1.1.4</w:t>
+        <w:t>ssh-copy-id -</w:t>
+      </w:r>
+      <w:proofErr w:type="spellStart"/>
+      <w:r>
+        <w:t>i</w:t>
+      </w:r>
+      <w:proofErr w:type="spellEnd"/>
+      <w:r>
+        <w:t xml:space="preserve"> /root/.ssh/id_rsa.pub azureuser@10.1.1.4</w:t>
       </w:r>
       <w:r>
         <w:br/>
@@ -603,15 +794,30 @@
       <w:pPr>
         <w:pStyle w:val="ListParagraph"/>
       </w:pPr>
-      <w:r>
-        <w:t>chmod 700 ~/.ssh</w:t>
+      <w:proofErr w:type="spellStart"/>
+      <w:r>
+        <w:t>chmod</w:t>
+      </w:r>
+      <w:proofErr w:type="spellEnd"/>
+      <w:r>
+        <w:t xml:space="preserve"> 700 ~/.ssh</w:t>
       </w:r>
       <w:r>
         <w:br/>
       </w:r>
-      <w:r>
-        <w:t>chmod 600 ~/.ssh/authorized_keys</w:t>
-      </w:r>
+      <w:proofErr w:type="spellStart"/>
+      <w:r>
+        <w:t>chmod</w:t>
+      </w:r>
+      <w:proofErr w:type="spellEnd"/>
+      <w:r>
+        <w:t xml:space="preserve"> 600 ~/.ssh/</w:t>
+      </w:r>
+      <w:proofErr w:type="spellStart"/>
+      <w:r>
+        <w:t>authorized_keys</w:t>
+      </w:r>
+      <w:proofErr w:type="spellEnd"/>
       <w:r>
         <w:t xml:space="preserve"> (usually this permission is not need if required you can use it)</w:t>
       </w:r>
@@ -682,8 +888,13 @@
       <w:pPr>
         <w:ind w:left="720"/>
       </w:pPr>
-      <w:r>
-        <w:t>mkdir ~/ansible</w:t>
+      <w:proofErr w:type="spellStart"/>
+      <w:r>
+        <w:t>mkdir</w:t>
+      </w:r>
+      <w:proofErr w:type="spellEnd"/>
+      <w:r>
+        <w:t xml:space="preserve"> ~/ansible</w:t>
       </w:r>
       <w:r>
         <w:br/>
@@ -697,6 +908,7 @@
         <w:ind w:left="720"/>
       </w:pPr>
       <w:r>
+        <w:lastRenderedPageBreak/>
         <w:t>You'll have:</w:t>
       </w:r>
       <w:r>
@@ -743,16 +955,26 @@
         <w:t>──</w:t>
       </w:r>
       <w:r>
-        <w:t xml:space="preserve"> ansible.cfg</w:t>
-      </w:r>
+        <w:t xml:space="preserve"> </w:t>
+      </w:r>
+      <w:proofErr w:type="spellStart"/>
+      <w:r>
+        <w:t>ansible.cfg</w:t>
+      </w:r>
+      <w:proofErr w:type="spellEnd"/>
     </w:p>
     <w:p>
       <w:pPr>
         <w:ind w:left="720"/>
       </w:pPr>
       <w:r>
-        <w:t>└── deploy.yml</w:t>
-      </w:r>
+        <w:t xml:space="preserve">└── </w:t>
+      </w:r>
+      <w:proofErr w:type="spellStart"/>
+      <w:r>
+        <w:t>deploy.yml</w:t>
+      </w:r>
+      <w:proofErr w:type="spellEnd"/>
     </w:p>
     <w:p>
       <w:pPr>
@@ -771,7 +993,6 @@
         <w:ind w:left="720"/>
       </w:pPr>
       <w:r>
-        <w:lastRenderedPageBreak/>
         <w:t>Create inventory:</w:t>
       </w:r>
     </w:p>
@@ -788,8 +1009,21 @@
         <w:ind w:left="720"/>
       </w:pPr>
       <w:r>
-        <w:t>10.1.1.4 ansible_user=azureuser</w:t>
-      </w:r>
+        <w:t xml:space="preserve">10.1.1.4 </w:t>
+      </w:r>
+      <w:proofErr w:type="spellStart"/>
+      <w:r>
+        <w:t>ansible_user</w:t>
+      </w:r>
+      <w:proofErr w:type="spellEnd"/>
+      <w:r>
+        <w:t>=</w:t>
+      </w:r>
+      <w:proofErr w:type="spellStart"/>
+      <w:r>
+        <w:t>azureuser</w:t>
+      </w:r>
+      <w:proofErr w:type="spellEnd"/>
     </w:p>
     <w:p>
       <w:pPr>
@@ -809,8 +1043,13 @@
         </w:numPr>
       </w:pPr>
       <w:r>
-        <w:t>Step 4: Create ansible.cfg</w:t>
-      </w:r>
+        <w:t xml:space="preserve">Step 4: Create </w:t>
+      </w:r>
+      <w:proofErr w:type="spellStart"/>
+      <w:r>
+        <w:t>ansible.cfg</w:t>
+      </w:r>
+      <w:proofErr w:type="spellEnd"/>
     </w:p>
     <w:p>
       <w:pPr>
@@ -828,8 +1067,13 @@
       <w:r>
         <w:br/>
       </w:r>
-      <w:r>
-        <w:t>host_key_checking = False</w:t>
+      <w:proofErr w:type="spellStart"/>
+      <w:r>
+        <w:t>host_key_checking</w:t>
+      </w:r>
+      <w:proofErr w:type="spellEnd"/>
+      <w:r>
+        <w:t xml:space="preserve"> = False</w:t>
       </w:r>
     </w:p>
     <w:p>
@@ -864,7 +1108,15 @@
         <w:br/>
       </w:r>
       <w:r>
-        <w:t>ansible all -i ansible/inventory -m ping</w:t>
+        <w:t>ansible all -</w:t>
+      </w:r>
+      <w:proofErr w:type="spellStart"/>
+      <w:r>
+        <w:t>i</w:t>
+      </w:r>
+      <w:proofErr w:type="spellEnd"/>
+      <w:r>
+        <w:t xml:space="preserve"> ansible/inventory -m ping</w:t>
       </w:r>
       <w:r>
         <w:br/>
@@ -945,8 +1197,15 @@
         <w:br/>
       </w:r>
       <w:r>
-        <w:t>ansible-galaxy collection install community.docker</w:t>
-      </w:r>
+        <w:t xml:space="preserve">ansible-galaxy collection install </w:t>
+      </w:r>
+      <w:proofErr w:type="spellStart"/>
+      <w:proofErr w:type="gramStart"/>
+      <w:r>
+        <w:t>community.docker</w:t>
+      </w:r>
+      <w:proofErr w:type="spellEnd"/>
+      <w:proofErr w:type="gramEnd"/>
     </w:p>
     <w:p/>
     <w:p>
@@ -966,7 +1225,15 @@
         <w:ind w:left="720"/>
       </w:pPr>
       <w:r>
-        <w:t>Create deploy.yml:</w:t>
+        <w:t xml:space="preserve">Create </w:t>
+      </w:r>
+      <w:proofErr w:type="spellStart"/>
+      <w:r>
+        <w:t>deploy.yml</w:t>
+      </w:r>
+      <w:proofErr w:type="spellEnd"/>
+      <w:r>
+        <w:t>:</w:t>
       </w:r>
     </w:p>
     <w:p>
@@ -990,7 +1257,6 @@
         <w:ind w:left="720"/>
       </w:pPr>
       <w:r>
-        <w:lastRenderedPageBreak/>
         <w:t xml:space="preserve">  hosts: app</w:t>
       </w:r>
     </w:p>
@@ -1015,8 +1281,37 @@
         <w:ind w:left="720"/>
       </w:pPr>
       <w:r>
-        <w:t xml:space="preserve">    docker_image: "{{ image_name }}"</w:t>
-      </w:r>
+        <w:t xml:space="preserve">    </w:t>
+      </w:r>
+      <w:proofErr w:type="spellStart"/>
+      <w:r>
+        <w:t>docker_image</w:t>
+      </w:r>
+      <w:proofErr w:type="spellEnd"/>
+      <w:r>
+        <w:t>: "</w:t>
+      </w:r>
+      <w:proofErr w:type="gramStart"/>
+      <w:r>
+        <w:t xml:space="preserve">{{ </w:t>
+      </w:r>
+      <w:proofErr w:type="spellStart"/>
+      <w:r>
+        <w:t>image</w:t>
+      </w:r>
+      <w:proofErr w:type="gramEnd"/>
+      <w:r>
+        <w:t>_</w:t>
+      </w:r>
+      <w:proofErr w:type="gramStart"/>
+      <w:r>
+        <w:t>name</w:t>
+      </w:r>
+      <w:proofErr w:type="spellEnd"/>
+      <w:r>
+        <w:t xml:space="preserve"> }}"</w:t>
+      </w:r>
+      <w:proofErr w:type="gramEnd"/>
     </w:p>
     <w:p>
       <w:pPr>
@@ -1044,7 +1339,20 @@
         <w:ind w:left="720"/>
       </w:pPr>
       <w:r>
-        <w:t xml:space="preserve">      community.docker.docker_image:</w:t>
+        <w:t xml:space="preserve">      </w:t>
+      </w:r>
+      <w:proofErr w:type="spellStart"/>
+      <w:proofErr w:type="gramStart"/>
+      <w:r>
+        <w:t>community.docker</w:t>
+      </w:r>
+      <w:proofErr w:type="gramEnd"/>
+      <w:r>
+        <w:t>.docker_image</w:t>
+      </w:r>
+      <w:proofErr w:type="spellEnd"/>
+      <w:r>
+        <w:t>:</w:t>
       </w:r>
     </w:p>
     <w:p>
@@ -1052,8 +1360,29 @@
         <w:ind w:left="720"/>
       </w:pPr>
       <w:r>
-        <w:t xml:space="preserve">        name: "{{ docker_image }}"</w:t>
-      </w:r>
+        <w:t xml:space="preserve">        name: "</w:t>
+      </w:r>
+      <w:proofErr w:type="gramStart"/>
+      <w:r>
+        <w:t xml:space="preserve">{{ </w:t>
+      </w:r>
+      <w:proofErr w:type="spellStart"/>
+      <w:r>
+        <w:t>docker</w:t>
+      </w:r>
+      <w:proofErr w:type="gramEnd"/>
+      <w:r>
+        <w:t>_</w:t>
+      </w:r>
+      <w:proofErr w:type="gramStart"/>
+      <w:r>
+        <w:t>image</w:t>
+      </w:r>
+      <w:proofErr w:type="spellEnd"/>
+      <w:r>
+        <w:t xml:space="preserve"> }}"</w:t>
+      </w:r>
+      <w:proofErr w:type="gramEnd"/>
     </w:p>
     <w:p>
       <w:pPr>
@@ -1076,7 +1405,20 @@
         <w:ind w:left="720"/>
       </w:pPr>
       <w:r>
-        <w:t xml:space="preserve">      community.docker.docker_container:</w:t>
+        <w:t xml:space="preserve">      </w:t>
+      </w:r>
+      <w:proofErr w:type="spellStart"/>
+      <w:proofErr w:type="gramStart"/>
+      <w:r>
+        <w:t>community.docker</w:t>
+      </w:r>
+      <w:proofErr w:type="gramEnd"/>
+      <w:r>
+        <w:t>.docker_container</w:t>
+      </w:r>
+      <w:proofErr w:type="spellEnd"/>
+      <w:r>
+        <w:t>:</w:t>
       </w:r>
     </w:p>
     <w:p>
@@ -1108,7 +1450,20 @@
         <w:ind w:left="720"/>
       </w:pPr>
       <w:r>
-        <w:t xml:space="preserve">      community.docker.docker_container:</w:t>
+        <w:t xml:space="preserve">      </w:t>
+      </w:r>
+      <w:proofErr w:type="spellStart"/>
+      <w:proofErr w:type="gramStart"/>
+      <w:r>
+        <w:t>community.docker</w:t>
+      </w:r>
+      <w:proofErr w:type="gramEnd"/>
+      <w:r>
+        <w:t>.docker_container</w:t>
+      </w:r>
+      <w:proofErr w:type="spellEnd"/>
+      <w:r>
+        <w:t>:</w:t>
       </w:r>
     </w:p>
     <w:p>
@@ -1124,8 +1479,29 @@
         <w:ind w:left="720"/>
       </w:pPr>
       <w:r>
-        <w:t xml:space="preserve">        image: "{{ docker_image }}"</w:t>
-      </w:r>
+        <w:t xml:space="preserve">        image: "</w:t>
+      </w:r>
+      <w:proofErr w:type="gramStart"/>
+      <w:r>
+        <w:t xml:space="preserve">{{ </w:t>
+      </w:r>
+      <w:proofErr w:type="spellStart"/>
+      <w:r>
+        <w:t>docker</w:t>
+      </w:r>
+      <w:proofErr w:type="gramEnd"/>
+      <w:r>
+        <w:t>_</w:t>
+      </w:r>
+      <w:proofErr w:type="gramStart"/>
+      <w:r>
+        <w:t>image</w:t>
+      </w:r>
+      <w:proofErr w:type="spellEnd"/>
+      <w:r>
+        <w:t xml:space="preserve"> }}"</w:t>
+      </w:r>
+      <w:proofErr w:type="gramEnd"/>
     </w:p>
     <w:p>
       <w:pPr>
@@ -1140,7 +1516,15 @@
         <w:ind w:left="720"/>
       </w:pPr>
       <w:r>
-        <w:t xml:space="preserve">        restart_policy: always</w:t>
+        <w:t xml:space="preserve">        </w:t>
+      </w:r>
+      <w:proofErr w:type="spellStart"/>
+      <w:r>
+        <w:t>restart_policy</w:t>
+      </w:r>
+      <w:proofErr w:type="spellEnd"/>
+      <w:r>
+        <w:t>: always</w:t>
       </w:r>
     </w:p>
     <w:p>
@@ -1148,7 +1532,15 @@
         <w:ind w:left="720"/>
       </w:pPr>
       <w:r>
-        <w:t xml:space="preserve">        published_ports:</w:t>
+        <w:t xml:space="preserve">        </w:t>
+      </w:r>
+      <w:proofErr w:type="spellStart"/>
+      <w:r>
+        <w:t>published_ports</w:t>
+      </w:r>
+      <w:proofErr w:type="spellEnd"/>
+      <w:r>
+        <w:t>:</w:t>
       </w:r>
     </w:p>
     <w:p>
@@ -1173,6 +1565,7 @@
         </w:numPr>
       </w:pPr>
       <w:r>
+        <w:lastRenderedPageBreak/>
         <w:t>Step 8: Test the Playbook</w:t>
       </w:r>
       <w:r>
@@ -1187,7 +1580,15 @@
         <w:ind w:left="1440"/>
       </w:pPr>
       <w:r>
-        <w:t>ansible-playbook deploy.yml \</w:t>
+        <w:t xml:space="preserve">ansible-playbook </w:t>
+      </w:r>
+      <w:proofErr w:type="spellStart"/>
+      <w:r>
+        <w:t>deploy.yml</w:t>
+      </w:r>
+      <w:proofErr w:type="spellEnd"/>
+      <w:r>
+        <w:t xml:space="preserve"> \</w:t>
       </w:r>
     </w:p>
     <w:p>
@@ -1195,7 +1596,15 @@
         <w:ind w:left="1440"/>
       </w:pPr>
       <w:r>
-        <w:t>--extra-vars "image_name=vicky1867/vickstudio:25"</w:t>
+        <w:t>--extra-vars "</w:t>
+      </w:r>
+      <w:proofErr w:type="spellStart"/>
+      <w:r>
+        <w:t>image_name</w:t>
+      </w:r>
+      <w:proofErr w:type="spellEnd"/>
+      <w:r>
+        <w:t>=vicky1867/vickstudio:25"</w:t>
       </w:r>
     </w:p>
     <w:p/>
@@ -1208,7 +1617,6 @@
         </w:numPr>
       </w:pPr>
       <w:r>
-        <w:lastRenderedPageBreak/>
         <w:t xml:space="preserve">Now when you run the Jenkins pipeline, it use as Jenkins user than you should make sure that keys must be available in Jenkins user </w:t>
       </w:r>
       <w:r>
@@ -1222,13 +1630,29 @@
       </w:r>
       <w:r>
         <w:br/>
-        <w:t xml:space="preserve">cp /root/.ssh/id_rsa  </w:t>
+        <w:t>cp /root/.ssh/</w:t>
+      </w:r>
+      <w:proofErr w:type="spellStart"/>
+      <w:r>
+        <w:t>id_rsa</w:t>
+      </w:r>
+      <w:proofErr w:type="spellEnd"/>
+      <w:r>
+        <w:t xml:space="preserve">  </w:t>
       </w:r>
       <w:r>
         <w:t xml:space="preserve"> </w:t>
       </w:r>
       <w:r>
-        <w:t>/var/lib/jenkins/.ssh/</w:t>
+        <w:t>/var/lib/</w:t>
+      </w:r>
+      <w:proofErr w:type="spellStart"/>
+      <w:r>
+        <w:t>jenkins</w:t>
+      </w:r>
+      <w:proofErr w:type="spellEnd"/>
+      <w:r>
+        <w:t>/.ssh/</w:t>
       </w:r>
       <w:r>
         <w:br/>
@@ -1240,13 +1664,44 @@
         <w:t xml:space="preserve"> </w:t>
       </w:r>
       <w:r>
-        <w:t>/var/lib/jenkins/.ssh/</w:t>
+        <w:t>/var/lib/</w:t>
+      </w:r>
+      <w:proofErr w:type="spellStart"/>
+      <w:r>
+        <w:t>jenkins</w:t>
+      </w:r>
+      <w:proofErr w:type="spellEnd"/>
+      <w:r>
+        <w:t>/.ssh/</w:t>
       </w:r>
       <w:r>
         <w:br/>
       </w:r>
-      <w:r>
-        <w:t>chown -R jenkins:jenkins /var/lib/jenkins/.ssh</w:t>
+      <w:proofErr w:type="spellStart"/>
+      <w:r>
+        <w:t>chown</w:t>
+      </w:r>
+      <w:proofErr w:type="spellEnd"/>
+      <w:r>
+        <w:t xml:space="preserve"> -R </w:t>
+      </w:r>
+      <w:proofErr w:type="spellStart"/>
+      <w:proofErr w:type="gramStart"/>
+      <w:r>
+        <w:t>jenkins:jenkins</w:t>
+      </w:r>
+      <w:proofErr w:type="spellEnd"/>
+      <w:proofErr w:type="gramEnd"/>
+      <w:r>
+        <w:t xml:space="preserve"> /var/lib/</w:t>
+      </w:r>
+      <w:proofErr w:type="spellStart"/>
+      <w:r>
+        <w:t>jenkins</w:t>
+      </w:r>
+      <w:proofErr w:type="spellEnd"/>
+      <w:r>
+        <w:t>/.ssh</w:t>
       </w:r>
     </w:p>
     <w:p/>
@@ -1265,7 +1720,15 @@
         <w:t>WARNING: REMOTE HOST IDENTIFICATION HAS CHANGED!</w:t>
       </w:r>
       <w:r>
-        <w:t xml:space="preserve"> Error during the Jenkins build than you have to run this command</w:t>
+        <w:t xml:space="preserve"> Error during the Jenkins build than you </w:t>
+      </w:r>
+      <w:proofErr w:type="gramStart"/>
+      <w:r>
+        <w:t>have to</w:t>
+      </w:r>
+      <w:proofErr w:type="gramEnd"/>
+      <w:r>
+        <w:t xml:space="preserve"> run this command</w:t>
       </w:r>
       <w:r>
         <w:br/>
@@ -1273,14 +1736,43 @@
       <w:r>
         <w:br/>
       </w:r>
-      <w:r>
-        <w:t xml:space="preserve">sudo -u jenkins </w:t>
+      <w:proofErr w:type="spellStart"/>
+      <w:r>
+        <w:t>sudo</w:t>
+      </w:r>
+      <w:proofErr w:type="spellEnd"/>
+      <w:r>
+        <w:t xml:space="preserve"> -u </w:t>
+      </w:r>
+      <w:proofErr w:type="spellStart"/>
+      <w:r>
+        <w:t>jenkins</w:t>
+      </w:r>
+      <w:proofErr w:type="spellEnd"/>
+      <w:r>
+        <w:t xml:space="preserve"> </w:t>
       </w:r>
       <w:r>
         <w:br/>
       </w:r>
       <w:r>
-        <w:t>ssh-keygen -f /var/lib/jenkins/.ssh/known_hosts -R 10.1.1.4</w:t>
+        <w:t>ssh-keygen -f /var/lib/</w:t>
+      </w:r>
+      <w:proofErr w:type="spellStart"/>
+      <w:r>
+        <w:t>jenkins</w:t>
+      </w:r>
+      <w:proofErr w:type="spellEnd"/>
+      <w:r>
+        <w:t>/.ssh/</w:t>
+      </w:r>
+      <w:proofErr w:type="spellStart"/>
+      <w:r>
+        <w:t>known_hosts</w:t>
+      </w:r>
+      <w:proofErr w:type="spellEnd"/>
+      <w:r>
+        <w:t xml:space="preserve"> -R 10.1.1.4</w:t>
       </w:r>
     </w:p>
     <w:p/>
@@ -1310,7 +1802,7 @@
           <w:noProof/>
         </w:rPr>
         <w:drawing>
-          <wp:inline distT="0" distB="0" distL="0" distR="0" wp14:anchorId="6624BD90" wp14:editId="27B8E03A">
+          <wp:inline distT="0" distB="0" distL="0" distR="0" wp14:anchorId="6624BD90" wp14:editId="327D480C">
             <wp:extent cx="5722620" cy="1043940"/>
             <wp:effectExtent l="0" t="0" r="0" b="3810"/>
             <wp:docPr id="1546658577" name="Picture 6"/>
@@ -1383,8 +1875,18 @@
           <w:bCs/>
           <w:lang w:val="en-US"/>
         </w:rPr>
-        <w:t>Which region to select for azure Mysql</w:t>
-      </w:r>
+        <w:t xml:space="preserve">Which region to select for azure </w:t>
+      </w:r>
+      <w:proofErr w:type="spellStart"/>
+      <w:r>
+        <w:rPr>
+          <w:b/>
+          <w:bCs/>
+          <w:lang w:val="en-US"/>
+        </w:rPr>
+        <w:t>Mysql</w:t>
+      </w:r>
+      <w:proofErr w:type="spellEnd"/>
     </w:p>
     <w:p>
       <w:pPr>
@@ -1410,6 +1912,7 @@
           <w:noProof/>
           <w:lang w:val="en-US"/>
         </w:rPr>
+        <w:lastRenderedPageBreak/>
         <w:drawing>
           <wp:inline distT="0" distB="0" distL="0" distR="0" wp14:anchorId="3291FAAE" wp14:editId="681BF0BE">
             <wp:extent cx="5731510" cy="1218565"/>
@@ -1458,9 +1961,8 @@
           <w:noProof/>
           <w:lang w:val="en-US"/>
         </w:rPr>
-        <w:lastRenderedPageBreak/>
         <w:drawing>
-          <wp:inline distT="0" distB="0" distL="0" distR="0" wp14:anchorId="0ED82905" wp14:editId="489C1AB1">
+          <wp:inline distT="0" distB="0" distL="0" distR="0" wp14:anchorId="0ED82905" wp14:editId="512FD14D">
             <wp:extent cx="5728970" cy="2369185"/>
             <wp:effectExtent l="0" t="0" r="5080" b="0"/>
             <wp:docPr id="821061478" name="Picture 6"/>
@@ -1552,14 +2054,7 @@
           <w:b/>
           <w:bCs/>
         </w:rPr>
-        <w:t>OWASP</w:t>
-      </w:r>
-      <w:r>
-        <w:rPr>
-          <w:b/>
-          <w:bCs/>
-        </w:rPr>
-        <w:t>?</w:t>
+        <w:t>OWASP?</w:t>
       </w:r>
     </w:p>
     <w:p>
@@ -1571,14 +2066,16 @@
         </w:numPr>
       </w:pPr>
       <w:r>
-        <w:t xml:space="preserve">Install the </w:t>
-      </w:r>
-      <w:r>
-        <w:t>OWASP Dependency-Check Plugin</w:t>
-      </w:r>
-      <w:r>
-        <w:t xml:space="preserve"> in jenkins</w:t>
-      </w:r>
+        <w:t>Install the OWASP Dependency-Check Plugin</w:t>
+      </w:r>
+      <w:r>
+        <w:t xml:space="preserve"> in </w:t>
+      </w:r>
+      <w:proofErr w:type="spellStart"/>
+      <w:r>
+        <w:t>jenkins</w:t>
+      </w:r>
+      <w:proofErr w:type="spellEnd"/>
     </w:p>
     <w:p>
       <w:pPr>
@@ -1592,20 +2089,16 @@
         </w:rPr>
       </w:pPr>
       <w:r>
-        <w:t xml:space="preserve">Add </w:t>
-      </w:r>
-      <w:r>
-        <w:t>Dependency-Check installations</w:t>
-      </w:r>
-      <w:r>
-        <w:t xml:space="preserve"> into the tools</w:t>
-      </w:r>
-      <w:r>
-        <w:t xml:space="preserve"> </w:t>
-      </w:r>
-      <w:r>
-        <w:t>in jenkins</w:t>
-      </w:r>
+        <w:t>Add Dependency-Check installations into the tools</w:t>
+      </w:r>
+      <w:r>
+        <w:t xml:space="preserve"> in </w:t>
+      </w:r>
+      <w:proofErr w:type="spellStart"/>
+      <w:r>
+        <w:t>jenkins</w:t>
+      </w:r>
+      <w:proofErr w:type="spellEnd"/>
     </w:p>
     <w:p>
       <w:pPr>
@@ -1654,17 +2147,23 @@
     <w:p>
       <w:pPr>
         <w:rPr>
-          <w:lang w:val="en-US"/>
-        </w:rPr>
-      </w:pPr>
-      <w:r>
-        <w:rPr>
+          <w:b/>
+          <w:bCs/>
+          <w:lang w:val="en-US"/>
+        </w:rPr>
+      </w:pPr>
+      <w:r>
+        <w:rPr>
+          <w:b/>
+          <w:bCs/>
           <w:lang w:val="en-US"/>
         </w:rPr>
         <w:t xml:space="preserve">How to configure </w:t>
       </w:r>
       <w:r>
         <w:rPr>
+          <w:b/>
+          <w:bCs/>
           <w:lang w:val="en-US"/>
         </w:rPr>
         <w:t>SonarQube</w:t>
@@ -1762,8 +2261,10 @@
       </w:pPr>
       <w:r>
         <w:rPr>
-          <w:lang w:val="en-US"/>
-        </w:rPr>
+          <w:noProof/>
+          <w:lang w:val="en-US"/>
+        </w:rPr>
+        <w:lastRenderedPageBreak/>
         <w:drawing>
           <wp:inline distT="0" distB="0" distL="0" distR="0" wp14:anchorId="6EDA4E33" wp14:editId="3CC47816">
             <wp:extent cx="5731510" cy="2799080"/>
@@ -1839,9 +2340,9 @@
       </w:pPr>
       <w:r>
         <w:rPr>
-          <w:lang w:val="en-US"/>
-        </w:rPr>
-        <w:lastRenderedPageBreak/>
+          <w:noProof/>
+          <w:lang w:val="en-US"/>
+        </w:rPr>
         <w:drawing>
           <wp:inline distT="0" distB="0" distL="0" distR="0" wp14:anchorId="6B2CE763" wp14:editId="1EC95DCA">
             <wp:extent cx="5731510" cy="2365375"/>
@@ -1913,15 +2414,27 @@
     <w:p>
       <w:pPr>
         <w:rPr>
-          <w:lang w:val="en-US"/>
-        </w:rPr>
-      </w:pPr>
-      <w:r>
-        <w:rPr>
+          <w:b/>
+          <w:bCs/>
+          <w:lang w:val="en-US"/>
+        </w:rPr>
+      </w:pPr>
+      <w:r>
+        <w:rPr>
+          <w:b/>
+          <w:bCs/>
           <w:lang w:val="en-US"/>
         </w:rPr>
         <w:t>How to add quality gate</w:t>
       </w:r>
+      <w:r>
+        <w:rPr>
+          <w:b/>
+          <w:bCs/>
+          <w:lang w:val="en-US"/>
+        </w:rPr>
+        <w:t xml:space="preserve"> response as webhooks</w:t>
+      </w:r>
     </w:p>
     <w:p>
       <w:pPr>
@@ -1934,10 +2447,10 @@
           <w:lang w:val="en-US"/>
         </w:rPr>
         <w:drawing>
-          <wp:inline distT="0" distB="0" distL="0" distR="0" wp14:anchorId="062F53D6" wp14:editId="17CA77BC">
-            <wp:extent cx="5731510" cy="1548130"/>
-            <wp:effectExtent l="0" t="0" r="2540" b="0"/>
-            <wp:docPr id="242059827" name="Picture 1"/>
+          <wp:inline distT="0" distB="0" distL="0" distR="0" wp14:anchorId="0E209A6C" wp14:editId="081DE853">
+            <wp:extent cx="5731510" cy="1997075"/>
+            <wp:effectExtent l="0" t="0" r="2540" b="3175"/>
+            <wp:docPr id="411118653" name="Picture 1"/>
             <wp:cNvGraphicFramePr>
               <a:graphicFrameLocks xmlns:a="http://schemas.openxmlformats.org/drawingml/2006/main" noChangeAspect="1"/>
             </wp:cNvGraphicFramePr>
@@ -1945,7 +2458,7 @@
               <a:graphicData uri="http://schemas.openxmlformats.org/drawingml/2006/picture">
                 <pic:pic xmlns:pic="http://schemas.openxmlformats.org/drawingml/2006/picture">
                   <pic:nvPicPr>
-                    <pic:cNvPr id="242059827" name=""/>
+                    <pic:cNvPr id="411118653" name=""/>
                     <pic:cNvPicPr/>
                   </pic:nvPicPr>
                   <pic:blipFill>
@@ -1957,7 +2470,7 @@
                   <pic:spPr>
                     <a:xfrm>
                       <a:off x="0" y="0"/>
-                      <a:ext cx="5731510" cy="1548130"/>
+                      <a:ext cx="5731510" cy="1997075"/>
                     </a:xfrm>
                     <a:prstGeom prst="rect">
                       <a:avLst/>
@@ -1983,11 +2496,288 @@
           <w:lang w:val="en-US"/>
         </w:rPr>
       </w:pPr>
+      <w:r>
+        <w:rPr>
+          <w:b/>
+          <w:bCs/>
+          <w:lang w:val="en-US"/>
+        </w:rPr>
+        <w:t>How to resolve No plugin found for prefix sonar?</w:t>
+      </w:r>
+      <w:r>
+        <w:rPr>
+          <w:lang w:val="en-US"/>
+        </w:rPr>
+        <w:br/>
+      </w:r>
+      <w:r>
+        <w:rPr>
+          <w:lang w:val="en-US"/>
+        </w:rPr>
+        <w:br/>
+      </w:r>
+      <w:r>
+        <w:rPr>
+          <w:noProof/>
+          <w:lang w:val="en-US"/>
+        </w:rPr>
+        <w:drawing>
+          <wp:inline distT="0" distB="0" distL="0" distR="0" wp14:anchorId="338C1AC1" wp14:editId="267E2A77">
+            <wp:extent cx="5721985" cy="1205230"/>
+            <wp:effectExtent l="0" t="0" r="0" b="0"/>
+            <wp:docPr id="1290533704" name="Picture 5"/>
+            <wp:cNvGraphicFramePr>
+              <a:graphicFrameLocks xmlns:a="http://schemas.openxmlformats.org/drawingml/2006/main" noChangeAspect="1"/>
+            </wp:cNvGraphicFramePr>
+            <a:graphic xmlns:a="http://schemas.openxmlformats.org/drawingml/2006/main">
+              <a:graphicData uri="http://schemas.openxmlformats.org/drawingml/2006/picture">
+                <pic:pic xmlns:pic="http://schemas.openxmlformats.org/drawingml/2006/picture">
+                  <pic:nvPicPr>
+                    <pic:cNvPr id="0" name="Picture 6"/>
+                    <pic:cNvPicPr>
+                      <a:picLocks noChangeAspect="1" noChangeArrowheads="1"/>
+                    </pic:cNvPicPr>
+                  </pic:nvPicPr>
+                  <pic:blipFill>
+                    <a:blip r:embed="rId16" cstate="print">
+                      <a:extLst>
+                        <a:ext uri="{28A0092B-C50C-407E-A947-70E740481C1C}">
+                          <a14:useLocalDpi xmlns:a14="http://schemas.microsoft.com/office/drawing/2010/main" val="0"/>
+                        </a:ext>
+                      </a:extLst>
+                    </a:blip>
+                    <a:srcRect/>
+                    <a:stretch>
+                      <a:fillRect/>
+                    </a:stretch>
+                  </pic:blipFill>
+                  <pic:spPr bwMode="auto">
+                    <a:xfrm>
+                      <a:off x="0" y="0"/>
+                      <a:ext cx="5721985" cy="1205230"/>
+                    </a:xfrm>
+                    <a:prstGeom prst="rect">
+                      <a:avLst/>
+                    </a:prstGeom>
+                    <a:noFill/>
+                    <a:ln>
+                      <a:noFill/>
+                    </a:ln>
+                  </pic:spPr>
+                </pic:pic>
+              </a:graphicData>
+            </a:graphic>
+          </wp:inline>
+        </w:drawing>
+      </w:r>
+    </w:p>
+    <w:p>
+      <w:pPr>
+        <w:pStyle w:val="ListParagraph"/>
+        <w:numPr>
+          <w:ilvl w:val="0"/>
+          <w:numId w:val="8"/>
+        </w:numPr>
+      </w:pPr>
+      <w:r>
+        <w:rPr>
+          <w:lang w:val="en-US"/>
+        </w:rPr>
+        <w:t xml:space="preserve">Previously I was able to run the command </w:t>
+      </w:r>
+      <w:proofErr w:type="spellStart"/>
+      <w:r>
+        <w:rPr>
+          <w:lang w:val="en-US"/>
+        </w:rPr>
+        <w:t>sh</w:t>
+      </w:r>
+      <w:proofErr w:type="spellEnd"/>
+      <w:r>
+        <w:rPr>
+          <w:lang w:val="en-US"/>
+        </w:rPr>
+        <w:t xml:space="preserve"> ‘</w:t>
+      </w:r>
+      <w:proofErr w:type="spellStart"/>
+      <w:r>
+        <w:rPr>
+          <w:lang w:val="en-US"/>
+        </w:rPr>
+        <w:t>mvn</w:t>
+      </w:r>
+      <w:proofErr w:type="spellEnd"/>
+      <w:r>
+        <w:rPr>
+          <w:lang w:val="en-US"/>
+        </w:rPr>
+        <w:t xml:space="preserve"> </w:t>
+      </w:r>
+      <w:proofErr w:type="spellStart"/>
+      <w:proofErr w:type="gramStart"/>
+      <w:r>
+        <w:rPr>
+          <w:lang w:val="en-US"/>
+        </w:rPr>
+        <w:t>sonar:sonar</w:t>
+      </w:r>
+      <w:proofErr w:type="spellEnd"/>
+      <w:proofErr w:type="gramEnd"/>
+      <w:r>
+        <w:rPr>
+          <w:lang w:val="en-US"/>
+        </w:rPr>
+        <w:t xml:space="preserve">’ but after few days I </w:t>
+      </w:r>
+      <w:proofErr w:type="gramStart"/>
+      <w:r>
+        <w:rPr>
+          <w:lang w:val="en-US"/>
+        </w:rPr>
+        <w:t>was not able to</w:t>
+      </w:r>
+      <w:proofErr w:type="gramEnd"/>
+      <w:r>
+        <w:rPr>
+          <w:lang w:val="en-US"/>
+        </w:rPr>
+        <w:t xml:space="preserve"> run and facing with the error state that </w:t>
+      </w:r>
+      <w:proofErr w:type="spellStart"/>
+      <w:r>
+        <w:rPr>
+          <w:lang w:val="en-US"/>
+        </w:rPr>
+        <w:t>mvn</w:t>
+      </w:r>
+      <w:proofErr w:type="spellEnd"/>
+      <w:r>
+        <w:rPr>
+          <w:lang w:val="en-US"/>
+        </w:rPr>
+        <w:t xml:space="preserve"> is not able </w:t>
+      </w:r>
+      <w:proofErr w:type="gramStart"/>
+      <w:r>
+        <w:rPr>
+          <w:lang w:val="en-US"/>
+        </w:rPr>
+        <w:t xml:space="preserve">to </w:t>
+      </w:r>
+      <w:r>
+        <w:t xml:space="preserve"> </w:t>
+      </w:r>
+      <w:r>
+        <w:t>locate</w:t>
+      </w:r>
+      <w:proofErr w:type="gramEnd"/>
+      <w:r>
+        <w:t xml:space="preserve"> the plugin automatically.</w:t>
+      </w:r>
+      <w:r>
+        <w:t xml:space="preserve"> </w:t>
+      </w:r>
+      <w:proofErr w:type="gramStart"/>
+      <w:r>
+        <w:t>So</w:t>
+      </w:r>
+      <w:proofErr w:type="gramEnd"/>
+      <w:r>
+        <w:t xml:space="preserve"> the issue with the </w:t>
+      </w:r>
+      <w:r>
+        <w:t xml:space="preserve">shorthand </w:t>
+      </w:r>
+      <w:proofErr w:type="spellStart"/>
+      <w:proofErr w:type="gramStart"/>
+      <w:r>
+        <w:t>sonar:sonar</w:t>
+      </w:r>
+      <w:proofErr w:type="spellEnd"/>
+      <w:proofErr w:type="gramEnd"/>
+    </w:p>
+    <w:p>
+      <w:pPr>
+        <w:pStyle w:val="ListParagraph"/>
+        <w:numPr>
+          <w:ilvl w:val="0"/>
+          <w:numId w:val="8"/>
+        </w:numPr>
+      </w:pPr>
+      <w:r>
+        <w:t xml:space="preserve">Later I changed the command from this </w:t>
+      </w:r>
+      <w:r>
+        <w:br/>
+      </w:r>
+      <w:proofErr w:type="spellStart"/>
+      <w:r>
+        <w:t>sh</w:t>
+      </w:r>
+      <w:proofErr w:type="spellEnd"/>
+      <w:r>
+        <w:t xml:space="preserve"> '</w:t>
+      </w:r>
+      <w:proofErr w:type="spellStart"/>
+      <w:r>
+        <w:t>mvn</w:t>
+      </w:r>
+      <w:proofErr w:type="spellEnd"/>
+      <w:r>
+        <w:t xml:space="preserve"> </w:t>
+      </w:r>
+      <w:proofErr w:type="spellStart"/>
+      <w:proofErr w:type="gramStart"/>
+      <w:r>
+        <w:t>org.sonarsource</w:t>
+      </w:r>
+      <w:proofErr w:type="gramEnd"/>
+      <w:r>
+        <w:t>.</w:t>
+      </w:r>
+      <w:proofErr w:type="gramStart"/>
+      <w:r>
+        <w:t>scanner.maven</w:t>
+      </w:r>
+      <w:proofErr w:type="gramEnd"/>
+      <w:r>
+        <w:t>:sonar-maven-</w:t>
+      </w:r>
+      <w:proofErr w:type="gramStart"/>
+      <w:r>
+        <w:t>plugin:sonar</w:t>
+      </w:r>
+      <w:proofErr w:type="spellEnd"/>
+      <w:proofErr w:type="gramEnd"/>
+      <w:r>
+        <w:t>'</w:t>
+      </w:r>
+    </w:p>
+    <w:p>
+      <w:pPr>
+        <w:rPr>
+          <w:lang w:val="en-US"/>
+        </w:rPr>
+      </w:pPr>
+    </w:p>
+    <w:p>
+      <w:pPr>
+        <w:rPr>
+          <w:lang w:val="en-US"/>
+        </w:rPr>
+      </w:pPr>
+    </w:p>
+    <w:p>
+      <w:pPr>
+        <w:rPr>
+          <w:lang w:val="en-US"/>
+        </w:rPr>
+      </w:pPr>
     </w:p>
     <w:sectPr>
-      <w:footerReference w:type="even" r:id="rId16"/>
-      <w:footerReference w:type="default" r:id="rId17"/>
-      <w:footerReference w:type="first" r:id="rId18"/>
+      <w:footerReference w:type="even" r:id="rId17"/>
+      <w:footerReference w:type="default" r:id="rId18"/>
+      <w:footerReference w:type="first" r:id="rId19"/>
       <w:pgSz w:w="11906" w:h="16838"/>
       <w:pgMar w:top="1440" w:right="1440" w:bottom="1440" w:left="1440" w:header="708" w:footer="708" w:gutter="0"/>
       <w:cols w:space="708"/>
@@ -2668,7 +3458,7 @@
   <w:abstractNum w:abstractNumId="2" w15:restartNumberingAfterBreak="0">
     <w:nsid w:val="2BA228FE"/>
     <w:multiLevelType w:val="hybridMultilevel"/>
-    <w:tmpl w:val="50E61616"/>
+    <w:tmpl w:val="549E83BA"/>
     <w:lvl w:ilvl="0" w:tplc="40090001">
       <w:start w:val="1"/>
       <w:numFmt w:val="bullet"/>

</xml_diff>

<commit_message>
removed the password for VM as well DB from dev env
</commit_message>
<xml_diff>
--- a/Enterprise level topics.docx
+++ b/Enterprise level topics.docx
@@ -1703,6 +1703,55 @@
       <w:r>
         <w:t>/.ssh</w:t>
       </w:r>
+      <w:r>
+        <w:br/>
+      </w:r>
+    </w:p>
+    <w:p>
+      <w:pPr>
+        <w:pStyle w:val="ListParagraph"/>
+      </w:pPr>
+      <w:proofErr w:type="spellStart"/>
+      <w:r>
+        <w:t>su</w:t>
+      </w:r>
+      <w:proofErr w:type="spellEnd"/>
+      <w:r>
+        <w:t xml:space="preserve"> - </w:t>
+      </w:r>
+      <w:proofErr w:type="spellStart"/>
+      <w:r>
+        <w:t>jenkins</w:t>
+      </w:r>
+      <w:proofErr w:type="spellEnd"/>
+      <w:r>
+        <w:br/>
+      </w:r>
+      <w:r>
+        <w:t>ssh-copy-id -</w:t>
+      </w:r>
+      <w:proofErr w:type="spellStart"/>
+      <w:r>
+        <w:t>i</w:t>
+      </w:r>
+      <w:proofErr w:type="spellEnd"/>
+      <w:r>
+        <w:t xml:space="preserve"> </w:t>
+      </w:r>
+      <w:r>
+        <w:t>/var/lib/</w:t>
+      </w:r>
+      <w:proofErr w:type="spellStart"/>
+      <w:r>
+        <w:t>jenkins</w:t>
+      </w:r>
+      <w:proofErr w:type="spellEnd"/>
+      <w:r>
+        <w:t>/</w:t>
+      </w:r>
+      <w:r>
+        <w:t>.ssh/id_rsa.pub azureuser@10.1.1.4</w:t>
+      </w:r>
     </w:p>
     <w:p/>
     <w:p>
@@ -1738,20 +1787,17 @@
       </w:r>
       <w:proofErr w:type="spellStart"/>
       <w:r>
-        <w:t>sudo</w:t>
-      </w:r>
-      <w:proofErr w:type="spellEnd"/>
-      <w:r>
-        <w:t xml:space="preserve"> -u </w:t>
+        <w:t>su</w:t>
+      </w:r>
+      <w:proofErr w:type="spellEnd"/>
+      <w:r>
+        <w:t xml:space="preserve"> - </w:t>
       </w:r>
       <w:proofErr w:type="spellStart"/>
       <w:r>
         <w:t>jenkins</w:t>
       </w:r>
       <w:proofErr w:type="spellEnd"/>
-      <w:r>
-        <w:t xml:space="preserve"> </w:t>
-      </w:r>
       <w:r>
         <w:br/>
       </w:r>
@@ -1802,7 +1848,7 @@
           <w:noProof/>
         </w:rPr>
         <w:drawing>
-          <wp:inline distT="0" distB="0" distL="0" distR="0" wp14:anchorId="6624BD90" wp14:editId="327D480C">
+          <wp:inline distT="0" distB="0" distL="0" distR="0" wp14:anchorId="6624BD90" wp14:editId="5AE17144">
             <wp:extent cx="5722620" cy="1043940"/>
             <wp:effectExtent l="0" t="0" r="0" b="3810"/>
             <wp:docPr id="1546658577" name="Picture 6"/>
@@ -1962,7 +2008,7 @@
           <w:lang w:val="en-US"/>
         </w:rPr>
         <w:drawing>
-          <wp:inline distT="0" distB="0" distL="0" distR="0" wp14:anchorId="0ED82905" wp14:editId="512FD14D">
+          <wp:inline distT="0" distB="0" distL="0" distR="0" wp14:anchorId="0ED82905" wp14:editId="1BCB21EE">
             <wp:extent cx="5728970" cy="2369185"/>
             <wp:effectExtent l="0" t="0" r="5080" b="0"/>
             <wp:docPr id="821061478" name="Picture 6"/>
@@ -2444,6 +2490,7 @@
       </w:pPr>
       <w:r>
         <w:rPr>
+          <w:noProof/>
           <w:lang w:val="en-US"/>
         </w:rPr>
         <w:drawing>
@@ -2522,7 +2569,7 @@
           <w:lang w:val="en-US"/>
         </w:rPr>
         <w:drawing>
-          <wp:inline distT="0" distB="0" distL="0" distR="0" wp14:anchorId="338C1AC1" wp14:editId="267E2A77">
+          <wp:inline distT="0" distB="0" distL="0" distR="0" wp14:anchorId="338C1AC1" wp14:editId="5F5A06FE">
             <wp:extent cx="5721985" cy="1205230"/>
             <wp:effectExtent l="0" t="0" r="0" b="0"/>
             <wp:docPr id="1290533704" name="Picture 5"/>
@@ -4715,6 +4762,7 @@
   <w:style w:type="character" w:default="1" w:styleId="DefaultParagraphFont">
     <w:name w:val="Default Paragraph Font"/>
     <w:uiPriority w:val="1"/>
+    <w:semiHidden/>
     <w:unhideWhenUsed/>
   </w:style>
   <w:style w:type="table" w:default="1" w:styleId="TableNormal">

</xml_diff>

<commit_message>
added comment to database
</commit_message>
<xml_diff>
--- a/Enterprise level topics.docx
+++ b/Enterprise level topics.docx
@@ -102,15 +102,7 @@
         <w:t xml:space="preserve">. </w:t>
       </w:r>
       <w:r>
-        <w:t xml:space="preserve">It connects the VM to a subnet within a </w:t>
-      </w:r>
-      <w:proofErr w:type="spellStart"/>
-      <w:r>
-        <w:t>VNet</w:t>
-      </w:r>
-      <w:proofErr w:type="spellEnd"/>
-      <w:r>
-        <w:t xml:space="preserve">, provides the VM with a private IP address, and can optionally be associated with a public IP </w:t>
+        <w:t xml:space="preserve">It connects the VM to a subnet within a VNet, provides the VM with a private IP address, and can optionally be associated with a public IP </w:t>
       </w:r>
       <w:r>
         <w:br/>
@@ -1848,7 +1840,7 @@
           <w:noProof/>
         </w:rPr>
         <w:drawing>
-          <wp:inline distT="0" distB="0" distL="0" distR="0" wp14:anchorId="6624BD90" wp14:editId="5AE17144">
+          <wp:inline distT="0" distB="0" distL="0" distR="0" wp14:anchorId="6624BD90" wp14:editId="13D0A4F3">
             <wp:extent cx="5722620" cy="1043940"/>
             <wp:effectExtent l="0" t="0" r="0" b="3810"/>
             <wp:docPr id="1546658577" name="Picture 6"/>
@@ -2008,7 +2000,7 @@
           <w:lang w:val="en-US"/>
         </w:rPr>
         <w:drawing>
-          <wp:inline distT="0" distB="0" distL="0" distR="0" wp14:anchorId="0ED82905" wp14:editId="1BCB21EE">
+          <wp:inline distT="0" distB="0" distL="0" distR="0" wp14:anchorId="0ED82905" wp14:editId="68A818EA">
             <wp:extent cx="5728970" cy="2369185"/>
             <wp:effectExtent l="0" t="0" r="5080" b="0"/>
             <wp:docPr id="821061478" name="Picture 6"/>
@@ -2569,7 +2561,7 @@
           <w:lang w:val="en-US"/>
         </w:rPr>
         <w:drawing>
-          <wp:inline distT="0" distB="0" distL="0" distR="0" wp14:anchorId="338C1AC1" wp14:editId="5F5A06FE">
+          <wp:inline distT="0" distB="0" distL="0" distR="0" wp14:anchorId="338C1AC1" wp14:editId="6ED7D234">
             <wp:extent cx="5721985" cy="1205230"/>
             <wp:effectExtent l="0" t="0" r="0" b="0"/>
             <wp:docPr id="1290533704" name="Picture 5"/>
@@ -2755,6 +2747,9 @@
         <w:t xml:space="preserve">Later I changed the command from this </w:t>
       </w:r>
       <w:r>
+        <w:t>to this</w:t>
+      </w:r>
+      <w:r>
         <w:br/>
       </w:r>
       <w:proofErr w:type="spellStart"/>
@@ -2800,6 +2795,275 @@
         <w:t>'</w:t>
       </w:r>
     </w:p>
+    <w:p/>
+    <w:p>
+      <w:pPr>
+        <w:rPr>
+          <w:b/>
+          <w:bCs/>
+        </w:rPr>
+      </w:pPr>
+      <w:r>
+        <w:rPr>
+          <w:b/>
+          <w:bCs/>
+        </w:rPr>
+        <w:t>Resources which require delegation for the subnet</w:t>
+      </w:r>
+    </w:p>
+    <w:p>
+      <w:pPr>
+        <w:pStyle w:val="ListParagraph"/>
+        <w:numPr>
+          <w:ilvl w:val="0"/>
+          <w:numId w:val="9"/>
+        </w:numPr>
+      </w:pPr>
+      <w:r>
+        <w:t>Azure MySQL Flexible Server</w:t>
+      </w:r>
+    </w:p>
+    <w:p>
+      <w:pPr>
+        <w:pStyle w:val="ListParagraph"/>
+        <w:numPr>
+          <w:ilvl w:val="0"/>
+          <w:numId w:val="9"/>
+        </w:numPr>
+      </w:pPr>
+      <w:r>
+        <w:t>Azure PostgreSQL Flexible Server</w:t>
+      </w:r>
+    </w:p>
+    <w:p>
+      <w:pPr>
+        <w:pStyle w:val="ListParagraph"/>
+        <w:numPr>
+          <w:ilvl w:val="0"/>
+          <w:numId w:val="9"/>
+        </w:numPr>
+      </w:pPr>
+      <w:r>
+        <w:t>Azure Container Instances</w:t>
+      </w:r>
+    </w:p>
+    <w:p>
+      <w:pPr>
+        <w:pStyle w:val="ListParagraph"/>
+        <w:numPr>
+          <w:ilvl w:val="0"/>
+          <w:numId w:val="9"/>
+        </w:numPr>
+      </w:pPr>
+      <w:r>
+        <w:t>Azure App Service VNet Integration</w:t>
+      </w:r>
+      <w:r>
+        <w:br/>
+      </w:r>
+    </w:p>
+    <w:p>
+      <w:pPr>
+        <w:rPr>
+          <w:b/>
+          <w:bCs/>
+          <w:lang w:val="en-US"/>
+        </w:rPr>
+      </w:pPr>
+      <w:r>
+        <w:rPr>
+          <w:b/>
+          <w:bCs/>
+          <w:lang w:val="en-US"/>
+        </w:rPr>
+        <w:t xml:space="preserve">How does application know about </w:t>
+      </w:r>
+      <w:r>
+        <w:rPr>
+          <w:b/>
+          <w:bCs/>
+          <w:lang w:val="en-US"/>
+        </w:rPr>
+        <w:t>MySQL</w:t>
+      </w:r>
+    </w:p>
+    <w:p>
+      <w:pPr>
+        <w:pStyle w:val="ListParagraph"/>
+        <w:numPr>
+          <w:ilvl w:val="0"/>
+          <w:numId w:val="10"/>
+        </w:numPr>
+      </w:pPr>
+      <w:r>
+        <w:t>The application.properties file contains the spring.datasource.url, which specifies the MySQL server address and the database name that the Spring Boot application uses to connect to the database</w:t>
+      </w:r>
+    </w:p>
+    <w:p>
+      <w:pPr>
+        <w:rPr>
+          <w:lang w:val="en-US"/>
+        </w:rPr>
+      </w:pPr>
+      <w:r>
+        <w:rPr>
+          <w:lang w:val="en-US"/>
+        </w:rPr>
+        <w:drawing>
+          <wp:inline distT="0" distB="0" distL="0" distR="0" wp14:anchorId="66B30584" wp14:editId="5F2F0165">
+            <wp:extent cx="5731510" cy="897890"/>
+            <wp:effectExtent l="0" t="0" r="2540" b="0"/>
+            <wp:docPr id="775099081" name="Picture 1"/>
+            <wp:cNvGraphicFramePr>
+              <a:graphicFrameLocks xmlns:a="http://schemas.openxmlformats.org/drawingml/2006/main" noChangeAspect="1"/>
+            </wp:cNvGraphicFramePr>
+            <a:graphic xmlns:a="http://schemas.openxmlformats.org/drawingml/2006/main">
+              <a:graphicData uri="http://schemas.openxmlformats.org/drawingml/2006/picture">
+                <pic:pic xmlns:pic="http://schemas.openxmlformats.org/drawingml/2006/picture">
+                  <pic:nvPicPr>
+                    <pic:cNvPr id="775099081" name=""/>
+                    <pic:cNvPicPr/>
+                  </pic:nvPicPr>
+                  <pic:blipFill>
+                    <a:blip r:embed="rId17"/>
+                    <a:stretch>
+                      <a:fillRect/>
+                    </a:stretch>
+                  </pic:blipFill>
+                  <pic:spPr>
+                    <a:xfrm>
+                      <a:off x="0" y="0"/>
+                      <a:ext cx="5731510" cy="897890"/>
+                    </a:xfrm>
+                    <a:prstGeom prst="rect">
+                      <a:avLst/>
+                    </a:prstGeom>
+                  </pic:spPr>
+                </pic:pic>
+              </a:graphicData>
+            </a:graphic>
+          </wp:inline>
+        </w:drawing>
+      </w:r>
+    </w:p>
+    <w:p>
+      <w:pPr>
+        <w:pStyle w:val="ListParagraph"/>
+        <w:numPr>
+          <w:ilvl w:val="0"/>
+          <w:numId w:val="10"/>
+        </w:numPr>
+      </w:pPr>
+      <w:r>
+        <w:rPr>
+          <w:lang w:val="en-US"/>
+        </w:rPr>
+        <w:t xml:space="preserve">In azure the </w:t>
+      </w:r>
+      <w:r>
+        <w:rPr>
+          <w:lang w:val="en-US"/>
+        </w:rPr>
+        <w:t>MySQL</w:t>
+      </w:r>
+      <w:r>
+        <w:rPr>
+          <w:lang w:val="en-US"/>
+        </w:rPr>
+        <w:t xml:space="preserve"> server name is - </w:t>
+      </w:r>
+      <w:r>
+        <w:rPr>
+          <w:b/>
+          <w:bCs/>
+        </w:rPr>
+        <w:t>vigneshmysqlserver</w:t>
+      </w:r>
+      <w:r>
+        <w:rPr>
+          <w:b/>
+          <w:bCs/>
+        </w:rPr>
+        <w:t>123</w:t>
+      </w:r>
+      <w:r>
+        <w:t xml:space="preserve"> &amp; the database name is </w:t>
+      </w:r>
+      <w:r>
+        <w:rPr>
+          <w:b/>
+          <w:bCs/>
+        </w:rPr>
+        <w:t>javaapp</w:t>
+      </w:r>
+    </w:p>
+    <w:p>
+      <w:pPr>
+        <w:pStyle w:val="ListParagraph"/>
+        <w:numPr>
+          <w:ilvl w:val="0"/>
+          <w:numId w:val="10"/>
+        </w:numPr>
+      </w:pPr>
+      <w:r>
+        <w:t>To</w:t>
+      </w:r>
+      <w:r>
+        <w:t xml:space="preserve"> get the </w:t>
+      </w:r>
+      <w:r>
+        <w:t>URL</w:t>
+      </w:r>
+      <w:r>
+        <w:t xml:space="preserve"> for the server, we use </w:t>
+      </w:r>
+      <w:r>
+        <w:t>fqdn</w:t>
+      </w:r>
+      <w:r>
+        <w:t xml:space="preserve"> in modules</w:t>
+      </w:r>
+    </w:p>
+    <w:p>
+      <w:r>
+        <w:drawing>
+          <wp:inline distT="0" distB="0" distL="0" distR="0" wp14:anchorId="3AF807CD" wp14:editId="58501CB6">
+            <wp:extent cx="5391902" cy="828791"/>
+            <wp:effectExtent l="0" t="0" r="0" b="9525"/>
+            <wp:docPr id="296525101" name="Picture 1"/>
+            <wp:cNvGraphicFramePr>
+              <a:graphicFrameLocks xmlns:a="http://schemas.openxmlformats.org/drawingml/2006/main" noChangeAspect="1"/>
+            </wp:cNvGraphicFramePr>
+            <a:graphic xmlns:a="http://schemas.openxmlformats.org/drawingml/2006/main">
+              <a:graphicData uri="http://schemas.openxmlformats.org/drawingml/2006/picture">
+                <pic:pic xmlns:pic="http://schemas.openxmlformats.org/drawingml/2006/picture">
+                  <pic:nvPicPr>
+                    <pic:cNvPr id="296525101" name=""/>
+                    <pic:cNvPicPr/>
+                  </pic:nvPicPr>
+                  <pic:blipFill>
+                    <a:blip r:embed="rId18"/>
+                    <a:stretch>
+                      <a:fillRect/>
+                    </a:stretch>
+                  </pic:blipFill>
+                  <pic:spPr>
+                    <a:xfrm>
+                      <a:off x="0" y="0"/>
+                      <a:ext cx="5391902" cy="828791"/>
+                    </a:xfrm>
+                    <a:prstGeom prst="rect">
+                      <a:avLst/>
+                    </a:prstGeom>
+                  </pic:spPr>
+                </pic:pic>
+              </a:graphicData>
+            </a:graphic>
+          </wp:inline>
+        </w:drawing>
+      </w:r>
+    </w:p>
+    <w:p/>
     <w:p>
       <w:pPr>
         <w:rPr>
@@ -2822,9 +3086,9 @@
       </w:pPr>
     </w:p>
     <w:sectPr>
-      <w:footerReference w:type="even" r:id="rId17"/>
-      <w:footerReference w:type="default" r:id="rId18"/>
-      <w:footerReference w:type="first" r:id="rId19"/>
+      <w:footerReference w:type="even" r:id="rId19"/>
+      <w:footerReference w:type="default" r:id="rId20"/>
+      <w:footerReference w:type="first" r:id="rId21"/>
       <w:pgSz w:w="11906" w:h="16838"/>
       <w:pgMar w:top="1440" w:right="1440" w:bottom="1440" w:left="1440" w:header="708" w:footer="708" w:gutter="0"/>
       <w:cols w:space="708"/>
@@ -3277,6 +3541,92 @@
 <file path=word/numbering.xml><?xml version="1.0" encoding="utf-8"?>
 <w:numbering xmlns:wpc="http://schemas.microsoft.com/office/word/2010/wordprocessingCanvas" xmlns:cx="http://schemas.microsoft.com/office/drawing/2014/chartex" xmlns:cx1="http://schemas.microsoft.com/office/drawing/2015/9/8/chartex" xmlns:cx2="http://schemas.microsoft.com/office/drawing/2015/10/21/chartex" xmlns:cx3="http://schemas.microsoft.com/office/drawing/2016/5/9/chartex" xmlns:cx4="http://schemas.microsoft.com/office/drawing/2016/5/10/chartex" xmlns:cx5="http://schemas.microsoft.com/office/drawing/2016/5/11/chartex" xmlns:cx6="http://schemas.microsoft.com/office/drawing/2016/5/12/chartex" xmlns:cx7="http://schemas.microsoft.com/office/drawing/2016/5/13/chartex" xmlns:cx8="http://schemas.microsoft.com/office/drawing/2016/5/14/chartex" xmlns:mc="http://schemas.openxmlformats.org/markup-compatibility/2006" xmlns:aink="http://schemas.microsoft.com/office/drawing/2016/ink" xmlns:am3d="http://schemas.microsoft.com/office/drawing/2017/model3d" xmlns:o="urn:schemas-microsoft-com:office:office" xmlns:oel="http://schemas.microsoft.com/office/2019/extlst" xmlns:r="http://schemas.openxmlformats.org/officeDocument/2006/relationships" xmlns:m="http://schemas.openxmlformats.org/officeDocument/2006/math" xmlns:v="urn:schemas-microsoft-com:vml" xmlns:wp14="http://schemas.microsoft.com/office/word/2010/wordprocessingDrawing" xmlns:wp="http://schemas.openxmlformats.org/drawingml/2006/wordprocessingDrawing" xmlns:w10="urn:schemas-microsoft-com:office:word" xmlns:w="http://schemas.openxmlformats.org/wordprocessingml/2006/main" xmlns:w14="http://schemas.microsoft.com/office/word/2010/wordml" xmlns:w15="http://schemas.microsoft.com/office/word/2012/wordml" xmlns:w16cex="http://schemas.microsoft.com/office/word/2018/wordml/cex" xmlns:w16cid="http://schemas.microsoft.com/office/word/2016/wordml/cid" xmlns:w16="http://schemas.microsoft.com/office/word/2018/wordml" xmlns:w16du="http://schemas.microsoft.com/office/word/2023/wordml/word16du" xmlns:w16sdtdh="http://schemas.microsoft.com/office/word/2020/wordml/sdtdatahash" xmlns:w16sdtfl="http://schemas.microsoft.com/office/word/2024/wordml/sdtformatlock" xmlns:w16se="http://schemas.microsoft.com/office/word/2015/wordml/symex" xmlns:wpg="http://schemas.microsoft.com/office/word/2010/wordprocessingGroup" xmlns:wpi="http://schemas.microsoft.com/office/word/2010/wordprocessingInk" xmlns:wne="http://schemas.microsoft.com/office/word/2006/wordml" xmlns:wps="http://schemas.microsoft.com/office/word/2010/wordprocessingShape" mc:Ignorable="w14 w15 w16se w16cid w16 w16cex w16sdtdh w16sdtfl w16du wp14">
   <w:abstractNum w:abstractNumId="0" w15:restartNumberingAfterBreak="0">
+    <w:nsid w:val="11E24C20"/>
+    <w:multiLevelType w:val="hybridMultilevel"/>
+    <w:tmpl w:val="39FAA73C"/>
+    <w:lvl w:ilvl="0" w:tplc="4009000F">
+      <w:start w:val="1"/>
+      <w:numFmt w:val="decimal"/>
+      <w:lvlText w:val="%1."/>
+      <w:lvlJc w:val="left"/>
+      <w:pPr>
+        <w:ind w:left="720" w:hanging="360"/>
+      </w:pPr>
+    </w:lvl>
+    <w:lvl w:ilvl="1" w:tplc="40090019" w:tentative="1">
+      <w:start w:val="1"/>
+      <w:numFmt w:val="lowerLetter"/>
+      <w:lvlText w:val="%2."/>
+      <w:lvlJc w:val="left"/>
+      <w:pPr>
+        <w:ind w:left="1440" w:hanging="360"/>
+      </w:pPr>
+    </w:lvl>
+    <w:lvl w:ilvl="2" w:tplc="4009001B" w:tentative="1">
+      <w:start w:val="1"/>
+      <w:numFmt w:val="lowerRoman"/>
+      <w:lvlText w:val="%3."/>
+      <w:lvlJc w:val="right"/>
+      <w:pPr>
+        <w:ind w:left="2160" w:hanging="180"/>
+      </w:pPr>
+    </w:lvl>
+    <w:lvl w:ilvl="3" w:tplc="4009000F" w:tentative="1">
+      <w:start w:val="1"/>
+      <w:numFmt w:val="decimal"/>
+      <w:lvlText w:val="%4."/>
+      <w:lvlJc w:val="left"/>
+      <w:pPr>
+        <w:ind w:left="2880" w:hanging="360"/>
+      </w:pPr>
+    </w:lvl>
+    <w:lvl w:ilvl="4" w:tplc="40090019" w:tentative="1">
+      <w:start w:val="1"/>
+      <w:numFmt w:val="lowerLetter"/>
+      <w:lvlText w:val="%5."/>
+      <w:lvlJc w:val="left"/>
+      <w:pPr>
+        <w:ind w:left="3600" w:hanging="360"/>
+      </w:pPr>
+    </w:lvl>
+    <w:lvl w:ilvl="5" w:tplc="4009001B" w:tentative="1">
+      <w:start w:val="1"/>
+      <w:numFmt w:val="lowerRoman"/>
+      <w:lvlText w:val="%6."/>
+      <w:lvlJc w:val="right"/>
+      <w:pPr>
+        <w:ind w:left="4320" w:hanging="180"/>
+      </w:pPr>
+    </w:lvl>
+    <w:lvl w:ilvl="6" w:tplc="4009000F" w:tentative="1">
+      <w:start w:val="1"/>
+      <w:numFmt w:val="decimal"/>
+      <w:lvlText w:val="%7."/>
+      <w:lvlJc w:val="left"/>
+      <w:pPr>
+        <w:ind w:left="5040" w:hanging="360"/>
+      </w:pPr>
+    </w:lvl>
+    <w:lvl w:ilvl="7" w:tplc="40090019" w:tentative="1">
+      <w:start w:val="1"/>
+      <w:numFmt w:val="lowerLetter"/>
+      <w:lvlText w:val="%8."/>
+      <w:lvlJc w:val="left"/>
+      <w:pPr>
+        <w:ind w:left="5760" w:hanging="360"/>
+      </w:pPr>
+    </w:lvl>
+    <w:lvl w:ilvl="8" w:tplc="4009001B" w:tentative="1">
+      <w:start w:val="1"/>
+      <w:numFmt w:val="lowerRoman"/>
+      <w:lvlText w:val="%9."/>
+      <w:lvlJc w:val="right"/>
+      <w:pPr>
+        <w:ind w:left="6480" w:hanging="180"/>
+      </w:pPr>
+    </w:lvl>
+  </w:abstractNum>
+  <w:abstractNum w:abstractNumId="1" w15:restartNumberingAfterBreak="0">
     <w:nsid w:val="1E6A773F"/>
     <w:multiLevelType w:val="hybridMultilevel"/>
     <w:tmpl w:val="6504BC98"/>
@@ -3389,7 +3739,7 @@
       </w:rPr>
     </w:lvl>
   </w:abstractNum>
-  <w:abstractNum w:abstractNumId="1" w15:restartNumberingAfterBreak="0">
+  <w:abstractNum w:abstractNumId="2" w15:restartNumberingAfterBreak="0">
     <w:nsid w:val="1FF41C69"/>
     <w:multiLevelType w:val="hybridMultilevel"/>
     <w:tmpl w:val="2BA22AC6"/>
@@ -3502,7 +3852,7 @@
       </w:rPr>
     </w:lvl>
   </w:abstractNum>
-  <w:abstractNum w:abstractNumId="2" w15:restartNumberingAfterBreak="0">
+  <w:abstractNum w:abstractNumId="3" w15:restartNumberingAfterBreak="0">
     <w:nsid w:val="2BA228FE"/>
     <w:multiLevelType w:val="hybridMultilevel"/>
     <w:tmpl w:val="549E83BA"/>
@@ -3615,7 +3965,120 @@
       </w:rPr>
     </w:lvl>
   </w:abstractNum>
-  <w:abstractNum w:abstractNumId="3" w15:restartNumberingAfterBreak="0">
+  <w:abstractNum w:abstractNumId="4" w15:restartNumberingAfterBreak="0">
+    <w:nsid w:val="352470B2"/>
+    <w:multiLevelType w:val="hybridMultilevel"/>
+    <w:tmpl w:val="85A20E8C"/>
+    <w:lvl w:ilvl="0" w:tplc="40090001">
+      <w:start w:val="1"/>
+      <w:numFmt w:val="bullet"/>
+      <w:lvlText w:val=""/>
+      <w:lvlJc w:val="left"/>
+      <w:pPr>
+        <w:ind w:left="720" w:hanging="360"/>
+      </w:pPr>
+      <w:rPr>
+        <w:rFonts w:ascii="Symbol" w:hAnsi="Symbol" w:hint="default"/>
+      </w:rPr>
+    </w:lvl>
+    <w:lvl w:ilvl="1" w:tplc="40090003" w:tentative="1">
+      <w:start w:val="1"/>
+      <w:numFmt w:val="bullet"/>
+      <w:lvlText w:val="o"/>
+      <w:lvlJc w:val="left"/>
+      <w:pPr>
+        <w:ind w:left="1440" w:hanging="360"/>
+      </w:pPr>
+      <w:rPr>
+        <w:rFonts w:ascii="Courier New" w:hAnsi="Courier New" w:cs="Courier New" w:hint="default"/>
+      </w:rPr>
+    </w:lvl>
+    <w:lvl w:ilvl="2" w:tplc="40090005" w:tentative="1">
+      <w:start w:val="1"/>
+      <w:numFmt w:val="bullet"/>
+      <w:lvlText w:val=""/>
+      <w:lvlJc w:val="left"/>
+      <w:pPr>
+        <w:ind w:left="2160" w:hanging="360"/>
+      </w:pPr>
+      <w:rPr>
+        <w:rFonts w:ascii="Wingdings" w:hAnsi="Wingdings" w:hint="default"/>
+      </w:rPr>
+    </w:lvl>
+    <w:lvl w:ilvl="3" w:tplc="40090001" w:tentative="1">
+      <w:start w:val="1"/>
+      <w:numFmt w:val="bullet"/>
+      <w:lvlText w:val=""/>
+      <w:lvlJc w:val="left"/>
+      <w:pPr>
+        <w:ind w:left="2880" w:hanging="360"/>
+      </w:pPr>
+      <w:rPr>
+        <w:rFonts w:ascii="Symbol" w:hAnsi="Symbol" w:hint="default"/>
+      </w:rPr>
+    </w:lvl>
+    <w:lvl w:ilvl="4" w:tplc="40090003" w:tentative="1">
+      <w:start w:val="1"/>
+      <w:numFmt w:val="bullet"/>
+      <w:lvlText w:val="o"/>
+      <w:lvlJc w:val="left"/>
+      <w:pPr>
+        <w:ind w:left="3600" w:hanging="360"/>
+      </w:pPr>
+      <w:rPr>
+        <w:rFonts w:ascii="Courier New" w:hAnsi="Courier New" w:cs="Courier New" w:hint="default"/>
+      </w:rPr>
+    </w:lvl>
+    <w:lvl w:ilvl="5" w:tplc="40090005" w:tentative="1">
+      <w:start w:val="1"/>
+      <w:numFmt w:val="bullet"/>
+      <w:lvlText w:val=""/>
+      <w:lvlJc w:val="left"/>
+      <w:pPr>
+        <w:ind w:left="4320" w:hanging="360"/>
+      </w:pPr>
+      <w:rPr>
+        <w:rFonts w:ascii="Wingdings" w:hAnsi="Wingdings" w:hint="default"/>
+      </w:rPr>
+    </w:lvl>
+    <w:lvl w:ilvl="6" w:tplc="40090001" w:tentative="1">
+      <w:start w:val="1"/>
+      <w:numFmt w:val="bullet"/>
+      <w:lvlText w:val=""/>
+      <w:lvlJc w:val="left"/>
+      <w:pPr>
+        <w:ind w:left="5040" w:hanging="360"/>
+      </w:pPr>
+      <w:rPr>
+        <w:rFonts w:ascii="Symbol" w:hAnsi="Symbol" w:hint="default"/>
+      </w:rPr>
+    </w:lvl>
+    <w:lvl w:ilvl="7" w:tplc="40090003" w:tentative="1">
+      <w:start w:val="1"/>
+      <w:numFmt w:val="bullet"/>
+      <w:lvlText w:val="o"/>
+      <w:lvlJc w:val="left"/>
+      <w:pPr>
+        <w:ind w:left="5760" w:hanging="360"/>
+      </w:pPr>
+      <w:rPr>
+        <w:rFonts w:ascii="Courier New" w:hAnsi="Courier New" w:cs="Courier New" w:hint="default"/>
+      </w:rPr>
+    </w:lvl>
+    <w:lvl w:ilvl="8" w:tplc="40090005" w:tentative="1">
+      <w:start w:val="1"/>
+      <w:numFmt w:val="bullet"/>
+      <w:lvlText w:val=""/>
+      <w:lvlJc w:val="left"/>
+      <w:pPr>
+        <w:ind w:left="6480" w:hanging="360"/>
+      </w:pPr>
+      <w:rPr>
+        <w:rFonts w:ascii="Wingdings" w:hAnsi="Wingdings" w:hint="default"/>
+      </w:rPr>
+    </w:lvl>
+  </w:abstractNum>
+  <w:abstractNum w:abstractNumId="5" w15:restartNumberingAfterBreak="0">
     <w:nsid w:val="50FA3B66"/>
     <w:multiLevelType w:val="hybridMultilevel"/>
     <w:tmpl w:val="AA028ADE"/>
@@ -3704,7 +4167,7 @@
       </w:pPr>
     </w:lvl>
   </w:abstractNum>
-  <w:abstractNum w:abstractNumId="4" w15:restartNumberingAfterBreak="0">
+  <w:abstractNum w:abstractNumId="6" w15:restartNumberingAfterBreak="0">
     <w:nsid w:val="658314F5"/>
     <w:multiLevelType w:val="hybridMultilevel"/>
     <w:tmpl w:val="0CFA52FA"/>
@@ -3817,7 +4280,7 @@
       </w:rPr>
     </w:lvl>
   </w:abstractNum>
-  <w:abstractNum w:abstractNumId="5" w15:restartNumberingAfterBreak="0">
+  <w:abstractNum w:abstractNumId="7" w15:restartNumberingAfterBreak="0">
     <w:nsid w:val="6D9258DA"/>
     <w:multiLevelType w:val="hybridMultilevel"/>
     <w:tmpl w:val="B8D66FA4"/>
@@ -3930,7 +4393,7 @@
       </w:rPr>
     </w:lvl>
   </w:abstractNum>
-  <w:abstractNum w:abstractNumId="6" w15:restartNumberingAfterBreak="0">
+  <w:abstractNum w:abstractNumId="8" w15:restartNumberingAfterBreak="0">
     <w:nsid w:val="6E6C0504"/>
     <w:multiLevelType w:val="hybridMultilevel"/>
     <w:tmpl w:val="83CA57B4"/>
@@ -4019,7 +4482,7 @@
       </w:pPr>
     </w:lvl>
   </w:abstractNum>
-  <w:abstractNum w:abstractNumId="7" w15:restartNumberingAfterBreak="0">
+  <w:abstractNum w:abstractNumId="9" w15:restartNumberingAfterBreak="0">
     <w:nsid w:val="6F167AFC"/>
     <w:multiLevelType w:val="hybridMultilevel"/>
     <w:tmpl w:val="E7DC6892"/>
@@ -4133,28 +4596,34 @@
     </w:lvl>
   </w:abstractNum>
   <w:num w:numId="1" w16cid:durableId="260530287">
+    <w:abstractNumId w:val="5"/>
+  </w:num>
+  <w:num w:numId="2" w16cid:durableId="411701566">
+    <w:abstractNumId w:val="1"/>
+  </w:num>
+  <w:num w:numId="3" w16cid:durableId="1926306991">
+    <w:abstractNumId w:val="2"/>
+  </w:num>
+  <w:num w:numId="4" w16cid:durableId="939606992">
+    <w:abstractNumId w:val="8"/>
+  </w:num>
+  <w:num w:numId="5" w16cid:durableId="656953985">
+    <w:abstractNumId w:val="9"/>
+  </w:num>
+  <w:num w:numId="6" w16cid:durableId="1243484746">
+    <w:abstractNumId w:val="6"/>
+  </w:num>
+  <w:num w:numId="7" w16cid:durableId="662201970">
+    <w:abstractNumId w:val="7"/>
+  </w:num>
+  <w:num w:numId="8" w16cid:durableId="1901475654">
     <w:abstractNumId w:val="3"/>
   </w:num>
-  <w:num w:numId="2" w16cid:durableId="411701566">
+  <w:num w:numId="9" w16cid:durableId="941838117">
     <w:abstractNumId w:val="0"/>
   </w:num>
-  <w:num w:numId="3" w16cid:durableId="1926306991">
-    <w:abstractNumId w:val="1"/>
-  </w:num>
-  <w:num w:numId="4" w16cid:durableId="939606992">
-    <w:abstractNumId w:val="6"/>
-  </w:num>
-  <w:num w:numId="5" w16cid:durableId="656953985">
-    <w:abstractNumId w:val="7"/>
-  </w:num>
-  <w:num w:numId="6" w16cid:durableId="1243484746">
+  <w:num w:numId="10" w16cid:durableId="1186476753">
     <w:abstractNumId w:val="4"/>
-  </w:num>
-  <w:num w:numId="7" w16cid:durableId="662201970">
-    <w:abstractNumId w:val="5"/>
-  </w:num>
-  <w:num w:numId="8" w16cid:durableId="1901475654">
-    <w:abstractNumId w:val="2"/>
   </w:num>
 </w:numbering>
 </file>
@@ -4762,7 +5231,6 @@
   <w:style w:type="character" w:default="1" w:styleId="DefaultParagraphFont">
     <w:name w:val="Default Paragraph Font"/>
     <w:uiPriority w:val="1"/>
-    <w:semiHidden/>
     <w:unhideWhenUsed/>
   </w:style>
   <w:style w:type="table" w:default="1" w:styleId="TableNormal">

</xml_diff>